<commit_message>
Keep it basic: plain shapes, plain BONK text, smaller spikes and lava
</commit_message>
<xml_diff>
--- a/Documentation/Bonkers_Paired_Prototype_Document.docx
+++ b/Documentation/Bonkers_Paired_Prototype_Document.docx
@@ -932,7 +932,7 @@
         <w:rPr>
           <w:rFonts w:ascii="Arial" w:cs="Arial" w:eastAsia="Arial" w:hAnsi="Arial"/>
         </w:rPr>
-        <w:t xml:space="preserve">punches and ice balls fly along the row (jump over them). Drop-bombs lock onto a spot with a flashing warning beam before they fall.</w:t>
+        <w:t xml:space="preserve">punches and ice balls fly along the row (jump over them). Drop-bombs lock onto a spot with a warning beam before they fall.</w:t>
       </w:r>
     </w:p>
     <w:p>
@@ -3268,7 +3268,7 @@
                 <w:rFonts w:ascii="Arial" w:cs="Arial" w:eastAsia="Arial" w:hAnsi="Arial"/>
                 <w:shd w:fill="FFF176" w:color="auto" w:val="clear"/>
               </w:rPr>
-              <w:t xml:space="preserve">[e.g. power-up effects, BONK feedback (text, shake, sounds), HUD, title and win screens]</w:t>
+              <w:t xml:space="preserve">[e.g. power-up effects, BONK feedback (text and sounds), HUD, title and win screens]</w:t>
             </w:r>
           </w:p>
         </w:tc>

</xml_diff>

<commit_message>
Easier jumps: smaller players, top-row headroom, low rolling saws, shorter lava
</commit_message>
<xml_diff>
--- a/Documentation/Bonkers_Paired_Prototype_Document.docx
+++ b/Documentation/Bonkers_Paired_Prototype_Document.docx
@@ -3389,7 +3389,7 @@
       <w:r>
         <w:drawing>
           <wp:inline distT="0" distB="0" distL="0" distR="0">
-            <wp:extent cx="5943600" cy="3724275"/>
+            <wp:extent cx="5943600" cy="3848100"/>
             <wp:effectExtent t="0" r="0" b="0" l="0"/>
             <wp:docPr id="1" name="" descr="" title=""/>
             <wp:cNvGraphicFramePr>
@@ -3414,7 +3414,7 @@
                   <pic:spPr bwMode="auto">
                     <a:xfrm>
                       <a:off x="0" y="0"/>
-                      <a:ext cx="5943600" cy="3724275"/>
+                      <a:ext cx="5943600" cy="3848100"/>
                     </a:xfrm>
                     <a:prstGeom prst="rect">
                       <a:avLst/>

</xml_diff>

<commit_message>
Doc + README: individual contributions, GitHub username
</commit_message>
<xml_diff>
--- a/Documentation/Bonkers_Paired_Prototype_Document.docx
+++ b/Documentation/Bonkers_Paired_Prototype_Document.docx
@@ -475,7 +475,7 @@
               <w:rPr>
                 <w:rtl w:val="0"/>
               </w:rPr>
-              <w:t xml:space="preserve">samarthborade007</w:t>
+              <w:t xml:space="preserve">Samarth-Borade</w:t>
             </w:r>
           </w:p>
         </w:tc>
@@ -4720,10 +4720,9 @@
             <w:r>
               <w:rPr>
                 <w:rFonts w:ascii="Arial" w:cs="Arial" w:eastAsia="Arial" w:hAnsi="Arial"/>
-                <w:shd w:fill="fff176" w:val="clear"/>
-                <w:rtl w:val="0"/>
-              </w:rPr>
-              <w:t xml:space="preserve">[e.g. player movement and physics (jump, push, stomp), place-based box logic, WebGL build and hosting]</w:t>
+                <w:rtl w:val="0"/>
+              </w:rPr>
+              <w:t xml:space="preserve">Player movement and physics (running, jumping, swimming, shoving and stomping), the place-based ? box logic (who counts as leading, fixed prizes, per-player cooldown), WebGL build and GitHub Pages hosting</w:t>
             </w:r>
             <w:r>
               <w:rPr>
@@ -4789,10 +4788,9 @@
             <w:r>
               <w:rPr>
                 <w:rFonts w:ascii="Arial" w:cs="Arial" w:eastAsia="Arial" w:hAnsi="Arial"/>
-                <w:shd w:fill="fff176" w:val="clear"/>
-                <w:rtl w:val="0"/>
-              </w:rPr>
-              <w:t xml:space="preserve">[e.g. level layout and hazards (lava, spikes, saws, water), respawn rows, level diagram]</w:t>
+                <w:rtl w:val="0"/>
+              </w:rPr>
+              <w:t xml:space="preserve">Level layout and hazards (lava, spikes, rolling saws, water), row-based respawn, tuning jump distances so every hazard can be cleared, level diagram</w:t>
             </w:r>
             <w:r>
               <w:rPr>
@@ -4858,10 +4856,9 @@
             <w:r>
               <w:rPr>
                 <w:rFonts w:ascii="Arial" w:cs="Arial" w:eastAsia="Arial" w:hAnsi="Arial"/>
-                <w:shd w:fill="fff176" w:val="clear"/>
-                <w:rtl w:val="0"/>
-              </w:rPr>
-              <w:t xml:space="preserve">[e.g. power-up effects, BONK feedback (text and sounds), HUD, title and win screens]</w:t>
+                <w:rtl w:val="0"/>
+              </w:rPr>
+              <w:t xml:space="preserve">Power-up effects (projectiles, drop-bomb warning, shield, banana, swap), BONK feedback (text and sounds), HUD with progress bar, title and win screens</w:t>
             </w:r>
             <w:r>
               <w:rPr>

</xml_diff>